<commit_message>
Use company name 'Paratech Solutions' on letterhead
Co-Authored-By: Claude Sonnet 5.5 <noreply@anthropic.com>
Claude-Session: https://claude.ai/code/session_01DFo29tTCUxjQWejnLXZyRx
</commit_message>
<xml_diff>
--- a/letterhead/ParaTech-Letterhead.docx
+++ b/letterhead/ParaTech-Letterhead.docx
@@ -298,7 +298,7 @@
               <w:sz w:val="13"/>
               <w:szCs w:val="13"/>
             </w:rPr>
-            <w:t xml:space="preserve">Paratech Solutions LLC  ·  SECP Reg. No. [0000000]  ·  NTN [0000000-0]</w:t>
+            <w:t xml:space="preserve">Paratech Solutions  ·  SECP Reg. No. [0000000]  ·  NTN [0000000-0]</w:t>
           </w:r>
         </w:p>
       </w:tc>
@@ -362,8 +362,8 @@
     <w:tblGrid>
       <w:gridCol w:w="2384"/>
       <w:gridCol w:w="300"/>
-      <w:gridCol w:w="4700"/>
-      <w:gridCol w:w="4522"/>
+      <w:gridCol w:w="6400"/>
+      <w:gridCol w:w="2822"/>
     </w:tblGrid>
     <w:tr>
       <w:trPr>
@@ -469,7 +469,7 @@
       </w:tc>
       <w:tc>
         <w:tcPr>
-          <w:tcW w:type="dxa" w:w="4700"/>
+          <w:tcW w:type="dxa" w:w="6400"/>
           <w:tcBorders>
             <w:top w:val="none" w:color="auto" w:sz="0"/>
             <w:left w:val="none" w:color="auto" w:sz="0"/>
@@ -511,6 +511,17 @@
             </w:rPr>
             <w:t xml:space="preserve">Tech</w:t>
           </w:r>
+          <w:r>
+            <w:rPr>
+              <w:rFonts w:ascii="Calibri" w:cs="Calibri" w:eastAsia="Calibri" w:hAnsi="Calibri"/>
+              <w:b/>
+              <w:bCs/>
+              <w:color w:val="FFFFFF"/>
+              <w:sz w:val="56"/>
+              <w:szCs w:val="56"/>
+            </w:rPr>
+            <w:t xml:space="preserve"> Solutions</w:t>
+          </w:r>
         </w:p>
         <w:p>
           <w:pPr>
@@ -519,17 +530,17 @@
           <w:r>
             <w:rPr>
               <w:rFonts w:ascii="Calibri" w:cs="Calibri" w:eastAsia="Calibri" w:hAnsi="Calibri"/>
-              <w:color w:val="B5AFA6"/>
+              <w:color w:val="D19A5F"/>
               <w:sz w:val="15"/>
               <w:szCs w:val="15"/>
             </w:rPr>
-            <w:t xml:space="preserve">S O L U T I O N S   L L C</w:t>
+            <w:t xml:space="preserve">A I  &amp;  D I G I T A L  S O L U T I O N S</w:t>
           </w:r>
         </w:p>
       </w:tc>
       <w:tc>
         <w:tcPr>
-          <w:tcW w:type="dxa" w:w="4522"/>
+          <w:tcW w:type="dxa" w:w="2822"/>
           <w:tcBorders>
             <w:top w:val="none" w:color="auto" w:sz="0"/>
             <w:left w:val="none" w:color="auto" w:sz="0"/>
@@ -541,39 +552,14 @@
             <w:top w:type="dxa" w:w="0"/>
             <w:left w:type="dxa" w:w="0"/>
             <w:bottom w:type="dxa" w:w="0"/>
-            <w:right w:type="dxa" w:w="1134"/>
+            <w:right w:type="dxa" w:w="0"/>
           </w:tcMar>
           <w:vAlign w:val="center"/>
         </w:tcPr>
         <w:p>
           <w:pPr>
             <w:spacing w:after="0" w:before="0"/>
-            <w:jc w:val="right"/>
-          </w:pPr>
-          <w:r>
-            <w:rPr>
-              <w:rFonts w:ascii="Calibri" w:cs="Calibri" w:eastAsia="Calibri" w:hAnsi="Calibri"/>
-              <w:color w:val="D19A5F"/>
-              <w:sz w:val="15"/>
-              <w:szCs w:val="15"/>
-            </w:rPr>
-            <w:t xml:space="preserve">A I  &amp;  D I G I T A L</w:t>
-          </w:r>
-        </w:p>
-        <w:p>
-          <w:pPr>
-            <w:spacing w:after="0" w:before="40"/>
-            <w:jc w:val="right"/>
-          </w:pPr>
-          <w:r>
-            <w:rPr>
-              <w:rFonts w:ascii="Calibri" w:cs="Calibri" w:eastAsia="Calibri" w:hAnsi="Calibri"/>
-              <w:color w:val="D19A5F"/>
-              <w:sz w:val="15"/>
-              <w:szCs w:val="15"/>
-            </w:rPr>
-            <w:t xml:space="preserve">S O L U T I O N S</w:t>
-          </w:r>
+          </w:pPr>
         </w:p>
       </w:tc>
     </w:tr>

</xml_diff>

<commit_message>
Fill in letterhead contact details (Lahore, phone, email, web)
Co-Authored-By: Claude Sonnet 5.5 <noreply@anthropic.com>
Claude-Session: https://claude.ai/code/session_01DFo29tTCUxjQWejnLXZyRx
</commit_message>
<xml_diff>
--- a/letterhead/ParaTech-Letterhead.docx
+++ b/letterhead/ParaTech-Letterhead.docx
@@ -132,7 +132,7 @@
               <w:sz w:val="16"/>
               <w:szCs w:val="16"/>
             </w:rPr>
-            <w:t xml:space="preserve">[Street address]</w:t>
+            <w:t xml:space="preserve">Lahore</w:t>
           </w:r>
         </w:p>
         <w:p>
@@ -146,7 +146,7 @@
               <w:sz w:val="16"/>
               <w:szCs w:val="16"/>
             </w:rPr>
-            <w:t xml:space="preserve">[City], Pakistan</w:t>
+            <w:t xml:space="preserve">Pakistan</w:t>
           </w:r>
         </w:p>
       </w:tc>
@@ -195,7 +195,7 @@
               <w:sz w:val="16"/>
               <w:szCs w:val="16"/>
             </w:rPr>
-            <w:t xml:space="preserve">[+92 000 0000000]</w:t>
+            <w:t xml:space="preserve">+92 331 3313567</w:t>
           </w:r>
         </w:p>
         <w:p>
@@ -261,44 +261,6 @@
               <w:szCs w:val="16"/>
             </w:rPr>
             <w:t xml:space="preserve">www.paratechsolutions.com</w:t>
-          </w:r>
-        </w:p>
-      </w:tc>
-    </w:tr>
-    <w:tr>
-      <w:tc>
-        <w:tcPr>
-          <w:tcW w:type="dxa" w:w="11906"/>
-          <w:gridSpan w:val="3"/>
-          <w:tcBorders>
-            <w:top w:val="none" w:color="auto" w:sz="0"/>
-            <w:left w:val="none" w:color="auto" w:sz="0"/>
-            <w:bottom w:val="none" w:color="auto" w:sz="0"/>
-            <w:right w:val="none" w:color="auto" w:sz="0"/>
-          </w:tcBorders>
-          <w:shd w:fill="0B0A09" w:color="auto" w:val="clear"/>
-          <w:tcMar>
-            <w:top w:type="dxa" w:w="80"/>
-            <w:left w:type="dxa" w:w="1134"/>
-            <w:bottom w:type="dxa" w:w="200"/>
-            <w:right w:type="dxa" w:w="1134"/>
-          </w:tcMar>
-        </w:tcPr>
-        <w:p>
-          <w:pPr>
-            <w:pBdr>
-              <w:top w:val="single" w:color="2A2521" w:sz="4" w:space="6"/>
-            </w:pBdr>
-            <w:spacing w:after="0" w:before="0"/>
-          </w:pPr>
-          <w:r>
-            <w:rPr>
-              <w:rFonts w:ascii="Calibri" w:cs="Calibri" w:eastAsia="Calibri" w:hAnsi="Calibri"/>
-              <w:color w:val="B5AFA6"/>
-              <w:sz w:val="13"/>
-              <w:szCs w:val="13"/>
-            </w:rPr>
-            <w:t xml:space="preserve">Paratech Solutions  ·  SECP Reg. No. [0000000]  ·  NTN [0000000-0]</w:t>
           </w:r>
         </w:p>
       </w:tc>

</xml_diff>

<commit_message>
Restore light letterhead design as 'ParaTech Solutions' with contact details
Co-Authored-By: Claude Sonnet 5.5 <noreply@anthropic.com>
Claude-Session: https://claude.ai/code/session_01DFo29tTCUxjQWejnLXZyRx
</commit_message>
<xml_diff>
--- a/letterhead/ParaTech-Letterhead.docx
+++ b/letterhead/ParaTech-Letterhead.docx
@@ -7,7 +7,7 @@
       <w:headerReference w:type="default" r:id="rId7"/>
       <w:footerReference w:type="default" r:id="rId8"/>
       <w:pgSz w:w="11906" w:h="16838" w:orient="portrait"/>
-      <w:pgMar w:top="3200" w:right="1134" w:bottom="2300" w:left="1134" w:header="0" w:footer="0" w:gutter="0"/>
+      <w:pgMar w:top="2700" w:right="1134" w:bottom="1500" w:left="1134" w:header="0" w:footer="0" w:gutter="0"/>
       <w:pgNumType/>
       <w:docGrid w:linePitch="360"/>
     </w:sectPr>
@@ -60,10 +60,21 @@
 <w:ftr xmlns:wpc="http://schemas.microsoft.com/office/word/2010/wordprocessingCanvas" xmlns:mc="http://schemas.openxmlformats.org/markup-compatibility/2006" xmlns:o="urn:schemas-microsoft-com:office:office" xmlns:r="http://schemas.openxmlformats.org/officeDocument/2006/relationships" xmlns:m="http://schemas.openxmlformats.org/officeDocument/2006/math" xmlns:v="urn:schemas-microsoft-com:vml" xmlns:wp14="http://schemas.microsoft.com/office/word/2010/wordprocessingDrawing" xmlns:wp="http://schemas.openxmlformats.org/drawingml/2006/wordprocessingDrawing" xmlns:w10="urn:schemas-microsoft-com:office:word" xmlns:w="http://schemas.openxmlformats.org/wordprocessingml/2006/main" xmlns:w14="http://schemas.microsoft.com/office/word/2010/wordml" xmlns:w15="http://schemas.microsoft.com/office/word/2012/wordml" xmlns:wpg="http://schemas.microsoft.com/office/word/2010/wordprocessingGroup" xmlns:wpi="http://schemas.microsoft.com/office/word/2010/wordprocessingInk" xmlns:wne="http://schemas.microsoft.com/office/word/2006/wordml" xmlns:wps="http://schemas.microsoft.com/office/word/2010/wordprocessingShape">
   <w:p>
     <w:pPr>
-      <w:shd w:fill="C08040" w:color="auto" w:val="clear"/>
-      <w:spacing w:after="0" w:before="0" w:line="40" w:lineRule="exact"/>
-      <w:ind w:left="-1134" w:right="-1134"/>
+      <w:pBdr>
+        <w:top w:val="single" w:color="D8D2C6" w:sz="4" w:space="6"/>
+      </w:pBdr>
+      <w:spacing w:after="140" w:before="0"/>
+      <w:jc w:val="center"/>
     </w:pPr>
+    <w:r>
+      <w:rPr>
+        <w:rFonts w:ascii="Calibri" w:cs="Calibri" w:eastAsia="Calibri" w:hAnsi="Calibri"/>
+        <w:color w:val="6B655E"/>
+        <w:sz w:val="15"/>
+        <w:szCs w:val="15"/>
+      </w:rPr>
+      <w:t xml:space="preserve">ParaTech Solutions  ·  Lahore, Pakistan  ·  www.paratechsolutions.com</w:t>
+    </w:r>
   </w:p>
   <w:tbl>
     <w:tblPr>
@@ -79,189 +90,59 @@
       </w:tblBorders>
     </w:tblPr>
     <w:tblGrid>
-      <w:gridCol w:w="5034"/>
-      <w:gridCol w:w="3600"/>
-      <w:gridCol w:w="3272"/>
+      <w:gridCol w:w="8506"/>
+      <w:gridCol w:w="3400"/>
     </w:tblGrid>
     <w:tr>
       <w:trPr>
-        <w:trHeight w:val="1000" w:hRule="atLeast"/>
+        <w:trHeight w:val="170" w:hRule="exact"/>
       </w:trPr>
       <w:tc>
         <w:tcPr>
-          <w:tcW w:type="dxa" w:w="5034"/>
+          <w:tcW w:type="dxa" w:w="8506"/>
           <w:tcBorders>
             <w:top w:val="none" w:color="auto" w:sz="0"/>
             <w:left w:val="none" w:color="auto" w:sz="0"/>
             <w:bottom w:val="none" w:color="auto" w:sz="0"/>
             <w:right w:val="none" w:color="auto" w:sz="0"/>
           </w:tcBorders>
-          <w:shd w:fill="0B0A09" w:color="auto" w:val="clear"/>
+          <w:shd w:fill="14120F" w:color="auto" w:val="clear"/>
           <w:tcMar>
-            <w:top w:type="dxa" w:w="200"/>
-            <w:left w:type="dxa" w:w="1134"/>
+            <w:top w:type="dxa" w:w="0"/>
+            <w:left w:type="dxa" w:w="0"/>
             <w:bottom w:type="dxa" w:w="0"/>
             <w:right w:type="dxa" w:w="0"/>
           </w:tcMar>
-          <w:vAlign w:val="top"/>
+          <w:vAlign w:val="center"/>
         </w:tcPr>
         <w:p>
           <w:pPr>
-            <w:spacing w:after="30" w:before="0"/>
-          </w:pPr>
-          <w:r>
-            <w:rPr>
-              <w:rFonts w:ascii="Calibri" w:cs="Calibri" w:eastAsia="Calibri" w:hAnsi="Calibri"/>
-              <w:b/>
-              <w:bCs/>
-              <w:color w:val="C08040"/>
-              <w:sz w:val="13"/>
-              <w:szCs w:val="13"/>
-            </w:rPr>
-            <w:t xml:space="preserve">A D D R E S S</w:t>
-          </w:r>
-        </w:p>
-        <w:p>
-          <w:pPr>
             <w:spacing w:after="0" w:before="0"/>
           </w:pPr>
-          <w:r>
-            <w:rPr>
-              <w:rFonts w:ascii="Calibri" w:cs="Calibri" w:eastAsia="Calibri" w:hAnsi="Calibri"/>
-              <w:color w:val="F4F1EA"/>
-              <w:sz w:val="16"/>
-              <w:szCs w:val="16"/>
-            </w:rPr>
-            <w:t xml:space="preserve">Lahore</w:t>
-          </w:r>
-        </w:p>
-        <w:p>
-          <w:pPr>
-            <w:spacing w:after="0" w:before="0"/>
-          </w:pPr>
-          <w:r>
-            <w:rPr>
-              <w:rFonts w:ascii="Calibri" w:cs="Calibri" w:eastAsia="Calibri" w:hAnsi="Calibri"/>
-              <w:color w:val="F4F1EA"/>
-              <w:sz w:val="16"/>
-              <w:szCs w:val="16"/>
-            </w:rPr>
-            <w:t xml:space="preserve">Pakistan</w:t>
-          </w:r>
         </w:p>
       </w:tc>
       <w:tc>
         <w:tcPr>
-          <w:tcW w:type="dxa" w:w="3600"/>
+          <w:tcW w:type="dxa" w:w="3400"/>
           <w:tcBorders>
             <w:top w:val="none" w:color="auto" w:sz="0"/>
             <w:left w:val="none" w:color="auto" w:sz="0"/>
             <w:bottom w:val="none" w:color="auto" w:sz="0"/>
             <w:right w:val="none" w:color="auto" w:sz="0"/>
           </w:tcBorders>
-          <w:shd w:fill="0B0A09" w:color="auto" w:val="clear"/>
+          <w:shd w:fill="C08040" w:color="auto" w:val="clear"/>
           <w:tcMar>
-            <w:top w:type="dxa" w:w="200"/>
+            <w:top w:type="dxa" w:w="0"/>
             <w:left w:type="dxa" w:w="0"/>
             <w:bottom w:type="dxa" w:w="0"/>
             <w:right w:type="dxa" w:w="0"/>
           </w:tcMar>
-          <w:vAlign w:val="top"/>
+          <w:vAlign w:val="center"/>
         </w:tcPr>
         <w:p>
           <w:pPr>
-            <w:spacing w:after="30" w:before="0"/>
-          </w:pPr>
-          <w:r>
-            <w:rPr>
-              <w:rFonts w:ascii="Calibri" w:cs="Calibri" w:eastAsia="Calibri" w:hAnsi="Calibri"/>
-              <w:b/>
-              <w:bCs/>
-              <w:color w:val="C08040"/>
-              <w:sz w:val="13"/>
-              <w:szCs w:val="13"/>
-            </w:rPr>
-            <w:t xml:space="preserve">C O N T A C T</w:t>
-          </w:r>
-        </w:p>
-        <w:p>
-          <w:pPr>
             <w:spacing w:after="0" w:before="0"/>
           </w:pPr>
-          <w:r>
-            <w:rPr>
-              <w:rFonts w:ascii="Calibri" w:cs="Calibri" w:eastAsia="Calibri" w:hAnsi="Calibri"/>
-              <w:color w:val="F4F1EA"/>
-              <w:sz w:val="16"/>
-              <w:szCs w:val="16"/>
-            </w:rPr>
-            <w:t xml:space="preserve">+92 331 3313567</w:t>
-          </w:r>
-        </w:p>
-        <w:p>
-          <w:pPr>
-            <w:spacing w:after="0" w:before="0"/>
-          </w:pPr>
-          <w:r>
-            <w:rPr>
-              <w:rFonts w:ascii="Calibri" w:cs="Calibri" w:eastAsia="Calibri" w:hAnsi="Calibri"/>
-              <w:color w:val="F4F1EA"/>
-              <w:sz w:val="16"/>
-              <w:szCs w:val="16"/>
-            </w:rPr>
-            <w:t xml:space="preserve">contact@paratechsolutions.com</w:t>
-          </w:r>
-        </w:p>
-      </w:tc>
-      <w:tc>
-        <w:tcPr>
-          <w:tcW w:type="dxa" w:w="3272"/>
-          <w:tcBorders>
-            <w:top w:val="none" w:color="auto" w:sz="0"/>
-            <w:left w:val="none" w:color="auto" w:sz="0"/>
-            <w:bottom w:val="none" w:color="auto" w:sz="0"/>
-            <w:right w:val="none" w:color="auto" w:sz="0"/>
-          </w:tcBorders>
-          <w:shd w:fill="0B0A09" w:color="auto" w:val="clear"/>
-          <w:tcMar>
-            <w:top w:type="dxa" w:w="200"/>
-            <w:left w:type="dxa" w:w="0"/>
-            <w:bottom w:type="dxa" w:w="0"/>
-            <w:right w:type="dxa" w:w="1134"/>
-          </w:tcMar>
-          <w:vAlign w:val="top"/>
-        </w:tcPr>
-        <w:p>
-          <w:pPr>
-            <w:spacing w:after="30" w:before="0"/>
-            <w:jc w:val="right"/>
-          </w:pPr>
-          <w:r>
-            <w:rPr>
-              <w:rFonts w:ascii="Calibri" w:cs="Calibri" w:eastAsia="Calibri" w:hAnsi="Calibri"/>
-              <w:b/>
-              <w:bCs/>
-              <w:color w:val="C08040"/>
-              <w:sz w:val="13"/>
-              <w:szCs w:val="13"/>
-            </w:rPr>
-            <w:t xml:space="preserve">O N L I N E</w:t>
-          </w:r>
-        </w:p>
-        <w:p>
-          <w:pPr>
-            <w:spacing w:after="0" w:before="0"/>
-            <w:jc w:val="right"/>
-          </w:pPr>
-          <w:r>
-            <w:rPr>
-              <w:rFonts w:ascii="Calibri" w:cs="Calibri" w:eastAsia="Calibri" w:hAnsi="Calibri"/>
-              <w:color w:val="F4F1EA"/>
-              <w:sz w:val="16"/>
-              <w:szCs w:val="16"/>
-            </w:rPr>
-            <w:t xml:space="preserve">www.paratechsolutions.com</w:t>
-          </w:r>
         </w:p>
       </w:tc>
     </w:tr>
@@ -322,25 +203,99 @@
       </w:tblBorders>
     </w:tblPr>
     <w:tblGrid>
-      <w:gridCol w:w="2384"/>
-      <w:gridCol w:w="300"/>
-      <w:gridCol w:w="6400"/>
-      <w:gridCol w:w="2822"/>
+      <w:gridCol w:w="3400"/>
+      <w:gridCol w:w="8506"/>
     </w:tblGrid>
     <w:tr>
       <w:trPr>
-        <w:trHeight w:val="2500" w:hRule="exact"/>
+        <w:trHeight w:val="280" w:hRule="exact"/>
       </w:trPr>
       <w:tc>
         <w:tcPr>
-          <w:tcW w:type="dxa" w:w="2384"/>
+          <w:tcW w:type="dxa" w:w="3400"/>
           <w:tcBorders>
             <w:top w:val="none" w:color="auto" w:sz="0"/>
             <w:left w:val="none" w:color="auto" w:sz="0"/>
             <w:bottom w:val="none" w:color="auto" w:sz="0"/>
             <w:right w:val="none" w:color="auto" w:sz="0"/>
           </w:tcBorders>
-          <w:shd w:fill="0B0A09" w:color="auto" w:val="clear"/>
+          <w:shd w:fill="C08040" w:color="auto" w:val="clear"/>
+          <w:tcMar>
+            <w:top w:type="dxa" w:w="0"/>
+            <w:left w:type="dxa" w:w="0"/>
+            <w:bottom w:type="dxa" w:w="0"/>
+            <w:right w:type="dxa" w:w="0"/>
+          </w:tcMar>
+          <w:vAlign w:val="center"/>
+        </w:tcPr>
+        <w:p>
+          <w:pPr>
+            <w:spacing w:after="0" w:before="0"/>
+          </w:pPr>
+        </w:p>
+      </w:tc>
+      <w:tc>
+        <w:tcPr>
+          <w:tcW w:type="dxa" w:w="8506"/>
+          <w:tcBorders>
+            <w:top w:val="none" w:color="auto" w:sz="0"/>
+            <w:left w:val="none" w:color="auto" w:sz="0"/>
+            <w:bottom w:val="none" w:color="auto" w:sz="0"/>
+            <w:right w:val="none" w:color="auto" w:sz="0"/>
+          </w:tcBorders>
+          <w:shd w:fill="14120F" w:color="auto" w:val="clear"/>
+          <w:tcMar>
+            <w:top w:type="dxa" w:w="0"/>
+            <w:left w:type="dxa" w:w="0"/>
+            <w:bottom w:type="dxa" w:w="0"/>
+            <w:right w:type="dxa" w:w="0"/>
+          </w:tcMar>
+          <w:vAlign w:val="center"/>
+        </w:tcPr>
+        <w:p>
+          <w:pPr>
+            <w:spacing w:after="0" w:before="0"/>
+          </w:pPr>
+        </w:p>
+      </w:tc>
+    </w:tr>
+  </w:tbl>
+  <w:p>
+    <w:pPr>
+      <w:spacing w:after="0" w:before="0" w:line="380" w:lineRule="exact"/>
+    </w:pPr>
+  </w:p>
+  <w:tbl>
+    <w:tblPr>
+      <w:tblW w:type="dxa" w:w="11906"/>
+      <w:tblInd w:type="dxa" w:w="-1134"/>
+      <w:tblBorders>
+        <w:top w:val="none" w:color="auto" w:sz="0"/>
+        <w:left w:val="none" w:color="auto" w:sz="0"/>
+        <w:bottom w:val="none" w:color="auto" w:sz="0"/>
+        <w:right w:val="none" w:color="auto" w:sz="0"/>
+        <w:insideH w:val="none" w:color="auto" w:sz="0"/>
+        <w:insideV w:val="none" w:color="auto" w:sz="0"/>
+      </w:tblBorders>
+    </w:tblPr>
+    <w:tblGrid>
+      <w:gridCol w:w="2184"/>
+      <w:gridCol w:w="4700"/>
+      <w:gridCol w:w="5022"/>
+    </w:tblGrid>
+    <w:tr>
+      <w:trPr>
+        <w:trHeight w:val="1150" w:hRule="atLeast"/>
+      </w:trPr>
+      <w:tc>
+        <w:tcPr>
+          <w:tcW w:type="dxa" w:w="2184"/>
+          <w:tcBorders>
+            <w:top w:val="none" w:color="auto" w:sz="0"/>
+            <w:left w:val="none" w:color="auto" w:sz="0"/>
+            <w:bottom w:val="none" w:color="auto" w:sz="0"/>
+            <w:right w:val="none" w:color="auto" w:sz="0"/>
+          </w:tcBorders>
           <w:tcMar>
             <w:top w:type="dxa" w:w="0"/>
             <w:left w:type="dxa" w:w="1134"/>
@@ -356,7 +311,7 @@
           <w:r>
             <w:drawing>
               <wp:inline distT="0" distB="0" distL="0" distR="0">
-                <wp:extent cx="800100" cy="723900"/>
+                <wp:extent cx="581025" cy="552450"/>
                 <wp:effectExtent t="0" r="0" b="0" l="0"/>
                 <wp:docPr id="1" name="logo" descr="ParaTech logo" title="ParaTech"/>
                 <wp:cNvGraphicFramePr>
@@ -381,7 +336,7 @@
                       <pic:spPr bwMode="auto">
                         <a:xfrm>
                           <a:off x="0" y="0"/>
-                          <a:ext cx="800100" cy="723900"/>
+                          <a:ext cx="581025" cy="552450"/>
                         </a:xfrm>
                         <a:prstGeom prst="rect">
                           <a:avLst/>
@@ -397,14 +352,13 @@
       </w:tc>
       <w:tc>
         <w:tcPr>
-          <w:tcW w:type="dxa" w:w="300"/>
+          <w:tcW w:type="dxa" w:w="4700"/>
           <w:tcBorders>
             <w:top w:val="none" w:color="auto" w:sz="0"/>
             <w:left w:val="none" w:color="auto" w:sz="0"/>
             <w:bottom w:val="none" w:color="auto" w:sz="0"/>
             <w:right w:val="none" w:color="auto" w:sz="0"/>
           </w:tcBorders>
-          <w:shd w:fill="0B0A09" w:color="auto" w:val="clear"/>
           <w:tcMar>
             <w:top w:type="dxa" w:w="0"/>
             <w:left w:type="dxa" w:w="0"/>
@@ -416,49 +370,15 @@
         <w:p>
           <w:pPr>
             <w:spacing w:after="0" w:before="0"/>
-            <w:jc w:val="center"/>
-          </w:pPr>
-          <w:r>
-            <w:rPr>
-              <w:rFonts w:ascii="Calibri" w:cs="Calibri" w:eastAsia="Calibri" w:hAnsi="Calibri"/>
-              <w:color w:val="C08040"/>
-              <w:sz w:val="56"/>
-              <w:szCs w:val="56"/>
-            </w:rPr>
-            <w:t xml:space="preserve">|</w:t>
-          </w:r>
-        </w:p>
-      </w:tc>
-      <w:tc>
-        <w:tcPr>
-          <w:tcW w:type="dxa" w:w="6400"/>
-          <w:tcBorders>
-            <w:top w:val="none" w:color="auto" w:sz="0"/>
-            <w:left w:val="none" w:color="auto" w:sz="0"/>
-            <w:bottom w:val="none" w:color="auto" w:sz="0"/>
-            <w:right w:val="none" w:color="auto" w:sz="0"/>
-          </w:tcBorders>
-          <w:shd w:fill="0B0A09" w:color="auto" w:val="clear"/>
-          <w:tcMar>
-            <w:top w:type="dxa" w:w="0"/>
-            <w:left w:type="dxa" w:w="0"/>
-            <w:bottom w:type="dxa" w:w="0"/>
-            <w:right w:type="dxa" w:w="0"/>
-          </w:tcMar>
-          <w:vAlign w:val="center"/>
-        </w:tcPr>
-        <w:p>
-          <w:pPr>
-            <w:spacing w:after="0" w:before="0"/>
           </w:pPr>
           <w:r>
             <w:rPr>
               <w:rFonts w:ascii="Calibri" w:cs="Calibri" w:eastAsia="Calibri" w:hAnsi="Calibri"/>
               <w:b/>
               <w:bCs/>
-              <w:color w:val="FFFFFF"/>
-              <w:sz w:val="56"/>
-              <w:szCs w:val="56"/>
+              <w:color w:val="14120F"/>
+              <w:sz w:val="50"/>
+              <w:szCs w:val="50"/>
             </w:rPr>
             <w:t xml:space="preserve">Para</w:t>
           </w:r>
@@ -467,9 +387,9 @@
               <w:rFonts w:ascii="Calibri" w:cs="Calibri" w:eastAsia="Calibri" w:hAnsi="Calibri"/>
               <w:b/>
               <w:bCs/>
-              <w:color w:val="C08040"/>
-              <w:sz w:val="56"/>
-              <w:szCs w:val="56"/>
+              <w:color w:val="8A5024"/>
+              <w:sz w:val="50"/>
+              <w:szCs w:val="50"/>
             </w:rPr>
             <w:t xml:space="preserve">Tech</w:t>
           </w:r>
@@ -478,21 +398,21 @@
               <w:rFonts w:ascii="Calibri" w:cs="Calibri" w:eastAsia="Calibri" w:hAnsi="Calibri"/>
               <w:b/>
               <w:bCs/>
-              <w:color w:val="FFFFFF"/>
-              <w:sz w:val="56"/>
-              <w:szCs w:val="56"/>
+              <w:color w:val="14120F"/>
+              <w:sz w:val="50"/>
+              <w:szCs w:val="50"/>
             </w:rPr>
             <w:t xml:space="preserve"> Solutions</w:t>
           </w:r>
         </w:p>
         <w:p>
           <w:pPr>
-            <w:spacing w:after="0" w:before="80"/>
+            <w:spacing w:after="0" w:before="70"/>
           </w:pPr>
           <w:r>
             <w:rPr>
               <w:rFonts w:ascii="Calibri" w:cs="Calibri" w:eastAsia="Calibri" w:hAnsi="Calibri"/>
-              <w:color w:val="D19A5F"/>
+              <w:color w:val="6B655E"/>
               <w:sz w:val="15"/>
               <w:szCs w:val="15"/>
             </w:rPr>
@@ -502,35 +422,104 @@
       </w:tc>
       <w:tc>
         <w:tcPr>
-          <w:tcW w:type="dxa" w:w="2822"/>
+          <w:tcW w:type="dxa" w:w="5022"/>
           <w:tcBorders>
             <w:top w:val="none" w:color="auto" w:sz="0"/>
             <w:left w:val="none" w:color="auto" w:sz="0"/>
             <w:bottom w:val="none" w:color="auto" w:sz="0"/>
             <w:right w:val="none" w:color="auto" w:sz="0"/>
           </w:tcBorders>
-          <w:shd w:fill="0B0A09" w:color="auto" w:val="clear"/>
           <w:tcMar>
             <w:top w:type="dxa" w:w="0"/>
             <w:left w:type="dxa" w:w="0"/>
             <w:bottom w:type="dxa" w:w="0"/>
-            <w:right w:type="dxa" w:w="0"/>
+            <w:right w:type="dxa" w:w="1134"/>
           </w:tcMar>
           <w:vAlign w:val="center"/>
         </w:tcPr>
         <w:p>
           <w:pPr>
-            <w:spacing w:after="0" w:before="0"/>
-          </w:pPr>
+            <w:spacing w:after="20" w:before="0"/>
+            <w:jc w:val="right"/>
+          </w:pPr>
+          <w:r>
+            <w:rPr>
+              <w:rFonts w:ascii="Calibri" w:cs="Calibri" w:eastAsia="Calibri" w:hAnsi="Calibri"/>
+              <w:b/>
+              <w:bCs/>
+              <w:color w:val="14120F"/>
+              <w:sz w:val="17"/>
+              <w:szCs w:val="17"/>
+            </w:rPr>
+            <w:t xml:space="preserve">Lahore, Pakistan</w:t>
+          </w:r>
+        </w:p>
+        <w:p>
+          <w:pPr>
+            <w:spacing w:after="20" w:before="0"/>
+            <w:jc w:val="right"/>
+          </w:pPr>
+          <w:r>
+            <w:rPr>
+              <w:rFonts w:ascii="Calibri" w:cs="Calibri" w:eastAsia="Calibri" w:hAnsi="Calibri"/>
+              <w:b w:val="false"/>
+              <w:bCs w:val="false"/>
+              <w:color w:val="4A4540"/>
+              <w:sz w:val="17"/>
+              <w:szCs w:val="17"/>
+            </w:rPr>
+            <w:t xml:space="preserve">+92 331 3313567</w:t>
+          </w:r>
+        </w:p>
+        <w:p>
+          <w:pPr>
+            <w:spacing w:after="20" w:before="0"/>
+            <w:jc w:val="right"/>
+          </w:pPr>
+          <w:r>
+            <w:rPr>
+              <w:rFonts w:ascii="Calibri" w:cs="Calibri" w:eastAsia="Calibri" w:hAnsi="Calibri"/>
+              <w:b w:val="false"/>
+              <w:bCs w:val="false"/>
+              <w:color w:val="4A4540"/>
+              <w:sz w:val="17"/>
+              <w:szCs w:val="17"/>
+            </w:rPr>
+            <w:t xml:space="preserve">contact@paratechsolutions.com</w:t>
+          </w:r>
+        </w:p>
+        <w:p>
+          <w:pPr>
+            <w:spacing w:after="20" w:before="0"/>
+            <w:jc w:val="right"/>
+          </w:pPr>
+          <w:r>
+            <w:rPr>
+              <w:rFonts w:ascii="Calibri" w:cs="Calibri" w:eastAsia="Calibri" w:hAnsi="Calibri"/>
+              <w:b w:val="false"/>
+              <w:bCs w:val="false"/>
+              <w:color w:val="4A4540"/>
+              <w:sz w:val="17"/>
+              <w:szCs w:val="17"/>
+            </w:rPr>
+            <w:t xml:space="preserve">www.paratechsolutions.com</w:t>
+          </w:r>
         </w:p>
       </w:tc>
     </w:tr>
   </w:tbl>
   <w:p>
     <w:pPr>
-      <w:shd w:fill="C08040" w:color="auto" w:val="clear"/>
-      <w:spacing w:after="0" w:before="0" w:line="40" w:lineRule="exact"/>
-      <w:ind w:left="-1134" w:right="-1134"/>
+      <w:spacing w:after="0" w:before="0" w:line="60" w:lineRule="exact"/>
+    </w:pPr>
+  </w:p>
+  <w:p>
+    <w:pPr>
+      <w:pBdr>
+        <w:bottom w:val="single" w:color="C08040" w:sz="8" w:space="1"/>
+      </w:pBdr>
+      <w:spacing w:after="0" w:before="0"/>
+      <w:ind w:left="0" w:right="0"/>
     </w:pPr>
   </w:p>
 </w:hdr>

</xml_diff>

<commit_message>
Restore dark letterhead design; 'Solutions LLC' -> 'Solutions'; add contact details
Co-Authored-By: Claude Sonnet 5.5 <noreply@anthropic.com>
Claude-Session: https://claude.ai/code/session_01DFo29tTCUxjQWejnLXZyRx
</commit_message>
<xml_diff>
--- a/letterhead/ParaTech-Letterhead.docx
+++ b/letterhead/ParaTech-Letterhead.docx
@@ -7,7 +7,7 @@
       <w:headerReference w:type="default" r:id="rId7"/>
       <w:footerReference w:type="default" r:id="rId8"/>
       <w:pgSz w:w="11906" w:h="16838" w:orient="portrait"/>
-      <w:pgMar w:top="2700" w:right="1134" w:bottom="1500" w:left="1134" w:header="0" w:footer="0" w:gutter="0"/>
+      <w:pgMar w:top="3200" w:right="1134" w:bottom="2300" w:left="1134" w:header="0" w:footer="0" w:gutter="0"/>
       <w:pgNumType/>
       <w:docGrid w:linePitch="360"/>
     </w:sectPr>
@@ -60,21 +60,10 @@
 <w:ftr xmlns:wpc="http://schemas.microsoft.com/office/word/2010/wordprocessingCanvas" xmlns:mc="http://schemas.openxmlformats.org/markup-compatibility/2006" xmlns:o="urn:schemas-microsoft-com:office:office" xmlns:r="http://schemas.openxmlformats.org/officeDocument/2006/relationships" xmlns:m="http://schemas.openxmlformats.org/officeDocument/2006/math" xmlns:v="urn:schemas-microsoft-com:vml" xmlns:wp14="http://schemas.microsoft.com/office/word/2010/wordprocessingDrawing" xmlns:wp="http://schemas.openxmlformats.org/drawingml/2006/wordprocessingDrawing" xmlns:w10="urn:schemas-microsoft-com:office:word" xmlns:w="http://schemas.openxmlformats.org/wordprocessingml/2006/main" xmlns:w14="http://schemas.microsoft.com/office/word/2010/wordml" xmlns:w15="http://schemas.microsoft.com/office/word/2012/wordml" xmlns:wpg="http://schemas.microsoft.com/office/word/2010/wordprocessingGroup" xmlns:wpi="http://schemas.microsoft.com/office/word/2010/wordprocessingInk" xmlns:wne="http://schemas.microsoft.com/office/word/2006/wordml" xmlns:wps="http://schemas.microsoft.com/office/word/2010/wordprocessingShape">
   <w:p>
     <w:pPr>
-      <w:pBdr>
-        <w:top w:val="single" w:color="D8D2C6" w:sz="4" w:space="6"/>
-      </w:pBdr>
-      <w:spacing w:after="140" w:before="0"/>
-      <w:jc w:val="center"/>
+      <w:shd w:fill="C08040" w:color="auto" w:val="clear"/>
+      <w:spacing w:after="0" w:before="0" w:line="40" w:lineRule="exact"/>
+      <w:ind w:left="-1134" w:right="-1134"/>
     </w:pPr>
-    <w:r>
-      <w:rPr>
-        <w:rFonts w:ascii="Calibri" w:cs="Calibri" w:eastAsia="Calibri" w:hAnsi="Calibri"/>
-        <w:color w:val="6B655E"/>
-        <w:sz w:val="15"/>
-        <w:szCs w:val="15"/>
-      </w:rPr>
-      <w:t xml:space="preserve">ParaTech Solutions  ·  Lahore, Pakistan  ·  www.paratechsolutions.com</w:t>
-    </w:r>
   </w:p>
   <w:tbl>
     <w:tblPr>
@@ -90,59 +79,189 @@
       </w:tblBorders>
     </w:tblPr>
     <w:tblGrid>
-      <w:gridCol w:w="8506"/>
-      <w:gridCol w:w="3400"/>
+      <w:gridCol w:w="5034"/>
+      <w:gridCol w:w="3600"/>
+      <w:gridCol w:w="3272"/>
     </w:tblGrid>
     <w:tr>
       <w:trPr>
-        <w:trHeight w:val="170" w:hRule="exact"/>
+        <w:trHeight w:val="1000" w:hRule="atLeast"/>
       </w:trPr>
       <w:tc>
         <w:tcPr>
-          <w:tcW w:type="dxa" w:w="8506"/>
+          <w:tcW w:type="dxa" w:w="5034"/>
           <w:tcBorders>
             <w:top w:val="none" w:color="auto" w:sz="0"/>
             <w:left w:val="none" w:color="auto" w:sz="0"/>
             <w:bottom w:val="none" w:color="auto" w:sz="0"/>
             <w:right w:val="none" w:color="auto" w:sz="0"/>
           </w:tcBorders>
-          <w:shd w:fill="14120F" w:color="auto" w:val="clear"/>
+          <w:shd w:fill="0B0A09" w:color="auto" w:val="clear"/>
           <w:tcMar>
-            <w:top w:type="dxa" w:w="0"/>
-            <w:left w:type="dxa" w:w="0"/>
+            <w:top w:type="dxa" w:w="200"/>
+            <w:left w:type="dxa" w:w="1134"/>
             <w:bottom w:type="dxa" w:w="0"/>
             <w:right w:type="dxa" w:w="0"/>
           </w:tcMar>
-          <w:vAlign w:val="center"/>
+          <w:vAlign w:val="top"/>
         </w:tcPr>
         <w:p>
           <w:pPr>
+            <w:spacing w:after="30" w:before="0"/>
+          </w:pPr>
+          <w:r>
+            <w:rPr>
+              <w:rFonts w:ascii="Calibri" w:cs="Calibri" w:eastAsia="Calibri" w:hAnsi="Calibri"/>
+              <w:b/>
+              <w:bCs/>
+              <w:color w:val="C08040"/>
+              <w:sz w:val="13"/>
+              <w:szCs w:val="13"/>
+            </w:rPr>
+            <w:t xml:space="preserve">A D D R E S S</w:t>
+          </w:r>
+        </w:p>
+        <w:p>
+          <w:pPr>
             <w:spacing w:after="0" w:before="0"/>
           </w:pPr>
+          <w:r>
+            <w:rPr>
+              <w:rFonts w:ascii="Calibri" w:cs="Calibri" w:eastAsia="Calibri" w:hAnsi="Calibri"/>
+              <w:color w:val="F4F1EA"/>
+              <w:sz w:val="16"/>
+              <w:szCs w:val="16"/>
+            </w:rPr>
+            <w:t xml:space="preserve">Lahore</w:t>
+          </w:r>
+        </w:p>
+        <w:p>
+          <w:pPr>
+            <w:spacing w:after="0" w:before="0"/>
+          </w:pPr>
+          <w:r>
+            <w:rPr>
+              <w:rFonts w:ascii="Calibri" w:cs="Calibri" w:eastAsia="Calibri" w:hAnsi="Calibri"/>
+              <w:color w:val="F4F1EA"/>
+              <w:sz w:val="16"/>
+              <w:szCs w:val="16"/>
+            </w:rPr>
+            <w:t xml:space="preserve">Pakistan</w:t>
+          </w:r>
         </w:p>
       </w:tc>
       <w:tc>
         <w:tcPr>
-          <w:tcW w:type="dxa" w:w="3400"/>
+          <w:tcW w:type="dxa" w:w="3600"/>
           <w:tcBorders>
             <w:top w:val="none" w:color="auto" w:sz="0"/>
             <w:left w:val="none" w:color="auto" w:sz="0"/>
             <w:bottom w:val="none" w:color="auto" w:sz="0"/>
             <w:right w:val="none" w:color="auto" w:sz="0"/>
           </w:tcBorders>
-          <w:shd w:fill="C08040" w:color="auto" w:val="clear"/>
+          <w:shd w:fill="0B0A09" w:color="auto" w:val="clear"/>
           <w:tcMar>
-            <w:top w:type="dxa" w:w="0"/>
+            <w:top w:type="dxa" w:w="200"/>
             <w:left w:type="dxa" w:w="0"/>
             <w:bottom w:type="dxa" w:w="0"/>
             <w:right w:type="dxa" w:w="0"/>
           </w:tcMar>
-          <w:vAlign w:val="center"/>
+          <w:vAlign w:val="top"/>
         </w:tcPr>
         <w:p>
           <w:pPr>
+            <w:spacing w:after="30" w:before="0"/>
+          </w:pPr>
+          <w:r>
+            <w:rPr>
+              <w:rFonts w:ascii="Calibri" w:cs="Calibri" w:eastAsia="Calibri" w:hAnsi="Calibri"/>
+              <w:b/>
+              <w:bCs/>
+              <w:color w:val="C08040"/>
+              <w:sz w:val="13"/>
+              <w:szCs w:val="13"/>
+            </w:rPr>
+            <w:t xml:space="preserve">C O N T A C T</w:t>
+          </w:r>
+        </w:p>
+        <w:p>
+          <w:pPr>
             <w:spacing w:after="0" w:before="0"/>
           </w:pPr>
+          <w:r>
+            <w:rPr>
+              <w:rFonts w:ascii="Calibri" w:cs="Calibri" w:eastAsia="Calibri" w:hAnsi="Calibri"/>
+              <w:color w:val="F4F1EA"/>
+              <w:sz w:val="16"/>
+              <w:szCs w:val="16"/>
+            </w:rPr>
+            <w:t xml:space="preserve">+92 331 3313567</w:t>
+          </w:r>
+        </w:p>
+        <w:p>
+          <w:pPr>
+            <w:spacing w:after="0" w:before="0"/>
+          </w:pPr>
+          <w:r>
+            <w:rPr>
+              <w:rFonts w:ascii="Calibri" w:cs="Calibri" w:eastAsia="Calibri" w:hAnsi="Calibri"/>
+              <w:color w:val="F4F1EA"/>
+              <w:sz w:val="16"/>
+              <w:szCs w:val="16"/>
+            </w:rPr>
+            <w:t xml:space="preserve">contact@paratechsolutions.com</w:t>
+          </w:r>
+        </w:p>
+      </w:tc>
+      <w:tc>
+        <w:tcPr>
+          <w:tcW w:type="dxa" w:w="3272"/>
+          <w:tcBorders>
+            <w:top w:val="none" w:color="auto" w:sz="0"/>
+            <w:left w:val="none" w:color="auto" w:sz="0"/>
+            <w:bottom w:val="none" w:color="auto" w:sz="0"/>
+            <w:right w:val="none" w:color="auto" w:sz="0"/>
+          </w:tcBorders>
+          <w:shd w:fill="0B0A09" w:color="auto" w:val="clear"/>
+          <w:tcMar>
+            <w:top w:type="dxa" w:w="200"/>
+            <w:left w:type="dxa" w:w="0"/>
+            <w:bottom w:type="dxa" w:w="0"/>
+            <w:right w:type="dxa" w:w="1134"/>
+          </w:tcMar>
+          <w:vAlign w:val="top"/>
+        </w:tcPr>
+        <w:p>
+          <w:pPr>
+            <w:spacing w:after="30" w:before="0"/>
+            <w:jc w:val="right"/>
+          </w:pPr>
+          <w:r>
+            <w:rPr>
+              <w:rFonts w:ascii="Calibri" w:cs="Calibri" w:eastAsia="Calibri" w:hAnsi="Calibri"/>
+              <w:b/>
+              <w:bCs/>
+              <w:color w:val="C08040"/>
+              <w:sz w:val="13"/>
+              <w:szCs w:val="13"/>
+            </w:rPr>
+            <w:t xml:space="preserve">O N L I N E</w:t>
+          </w:r>
+        </w:p>
+        <w:p>
+          <w:pPr>
+            <w:spacing w:after="0" w:before="0"/>
+            <w:jc w:val="right"/>
+          </w:pPr>
+          <w:r>
+            <w:rPr>
+              <w:rFonts w:ascii="Calibri" w:cs="Calibri" w:eastAsia="Calibri" w:hAnsi="Calibri"/>
+              <w:color w:val="F4F1EA"/>
+              <w:sz w:val="16"/>
+              <w:szCs w:val="16"/>
+            </w:rPr>
+            <w:t xml:space="preserve">www.paratechsolutions.com</w:t>
+          </w:r>
         </w:p>
       </w:tc>
     </w:tr>
@@ -203,99 +322,25 @@
       </w:tblBorders>
     </w:tblPr>
     <w:tblGrid>
-      <w:gridCol w:w="3400"/>
-      <w:gridCol w:w="8506"/>
+      <w:gridCol w:w="2384"/>
+      <w:gridCol w:w="300"/>
+      <w:gridCol w:w="4700"/>
+      <w:gridCol w:w="4522"/>
     </w:tblGrid>
     <w:tr>
       <w:trPr>
-        <w:trHeight w:val="280" w:hRule="exact"/>
+        <w:trHeight w:val="2500" w:hRule="exact"/>
       </w:trPr>
       <w:tc>
         <w:tcPr>
-          <w:tcW w:type="dxa" w:w="3400"/>
+          <w:tcW w:type="dxa" w:w="2384"/>
           <w:tcBorders>
             <w:top w:val="none" w:color="auto" w:sz="0"/>
             <w:left w:val="none" w:color="auto" w:sz="0"/>
             <w:bottom w:val="none" w:color="auto" w:sz="0"/>
             <w:right w:val="none" w:color="auto" w:sz="0"/>
           </w:tcBorders>
-          <w:shd w:fill="C08040" w:color="auto" w:val="clear"/>
-          <w:tcMar>
-            <w:top w:type="dxa" w:w="0"/>
-            <w:left w:type="dxa" w:w="0"/>
-            <w:bottom w:type="dxa" w:w="0"/>
-            <w:right w:type="dxa" w:w="0"/>
-          </w:tcMar>
-          <w:vAlign w:val="center"/>
-        </w:tcPr>
-        <w:p>
-          <w:pPr>
-            <w:spacing w:after="0" w:before="0"/>
-          </w:pPr>
-        </w:p>
-      </w:tc>
-      <w:tc>
-        <w:tcPr>
-          <w:tcW w:type="dxa" w:w="8506"/>
-          <w:tcBorders>
-            <w:top w:val="none" w:color="auto" w:sz="0"/>
-            <w:left w:val="none" w:color="auto" w:sz="0"/>
-            <w:bottom w:val="none" w:color="auto" w:sz="0"/>
-            <w:right w:val="none" w:color="auto" w:sz="0"/>
-          </w:tcBorders>
-          <w:shd w:fill="14120F" w:color="auto" w:val="clear"/>
-          <w:tcMar>
-            <w:top w:type="dxa" w:w="0"/>
-            <w:left w:type="dxa" w:w="0"/>
-            <w:bottom w:type="dxa" w:w="0"/>
-            <w:right w:type="dxa" w:w="0"/>
-          </w:tcMar>
-          <w:vAlign w:val="center"/>
-        </w:tcPr>
-        <w:p>
-          <w:pPr>
-            <w:spacing w:after="0" w:before="0"/>
-          </w:pPr>
-        </w:p>
-      </w:tc>
-    </w:tr>
-  </w:tbl>
-  <w:p>
-    <w:pPr>
-      <w:spacing w:after="0" w:before="0" w:line="380" w:lineRule="exact"/>
-    </w:pPr>
-  </w:p>
-  <w:tbl>
-    <w:tblPr>
-      <w:tblW w:type="dxa" w:w="11906"/>
-      <w:tblInd w:type="dxa" w:w="-1134"/>
-      <w:tblBorders>
-        <w:top w:val="none" w:color="auto" w:sz="0"/>
-        <w:left w:val="none" w:color="auto" w:sz="0"/>
-        <w:bottom w:val="none" w:color="auto" w:sz="0"/>
-        <w:right w:val="none" w:color="auto" w:sz="0"/>
-        <w:insideH w:val="none" w:color="auto" w:sz="0"/>
-        <w:insideV w:val="none" w:color="auto" w:sz="0"/>
-      </w:tblBorders>
-    </w:tblPr>
-    <w:tblGrid>
-      <w:gridCol w:w="2184"/>
-      <w:gridCol w:w="4700"/>
-      <w:gridCol w:w="5022"/>
-    </w:tblGrid>
-    <w:tr>
-      <w:trPr>
-        <w:trHeight w:val="1150" w:hRule="atLeast"/>
-      </w:trPr>
-      <w:tc>
-        <w:tcPr>
-          <w:tcW w:type="dxa" w:w="2184"/>
-          <w:tcBorders>
-            <w:top w:val="none" w:color="auto" w:sz="0"/>
-            <w:left w:val="none" w:color="auto" w:sz="0"/>
-            <w:bottom w:val="none" w:color="auto" w:sz="0"/>
-            <w:right w:val="none" w:color="auto" w:sz="0"/>
-          </w:tcBorders>
+          <w:shd w:fill="0B0A09" w:color="auto" w:val="clear"/>
           <w:tcMar>
             <w:top w:type="dxa" w:w="0"/>
             <w:left w:type="dxa" w:w="1134"/>
@@ -311,7 +356,7 @@
           <w:r>
             <w:drawing>
               <wp:inline distT="0" distB="0" distL="0" distR="0">
-                <wp:extent cx="581025" cy="552450"/>
+                <wp:extent cx="800100" cy="723900"/>
                 <wp:effectExtent t="0" r="0" b="0" l="0"/>
                 <wp:docPr id="1" name="logo" descr="ParaTech logo" title="ParaTech"/>
                 <wp:cNvGraphicFramePr>
@@ -336,7 +381,7 @@
                       <pic:spPr bwMode="auto">
                         <a:xfrm>
                           <a:off x="0" y="0"/>
-                          <a:ext cx="581025" cy="552450"/>
+                          <a:ext cx="800100" cy="723900"/>
                         </a:xfrm>
                         <a:prstGeom prst="rect">
                           <a:avLst/>
@@ -352,13 +397,14 @@
       </w:tc>
       <w:tc>
         <w:tcPr>
-          <w:tcW w:type="dxa" w:w="4700"/>
+          <w:tcW w:type="dxa" w:w="300"/>
           <w:tcBorders>
             <w:top w:val="none" w:color="auto" w:sz="0"/>
             <w:left w:val="none" w:color="auto" w:sz="0"/>
             <w:bottom w:val="none" w:color="auto" w:sz="0"/>
             <w:right w:val="none" w:color="auto" w:sz="0"/>
           </w:tcBorders>
+          <w:shd w:fill="0B0A09" w:color="auto" w:val="clear"/>
           <w:tcMar>
             <w:top w:type="dxa" w:w="0"/>
             <w:left w:type="dxa" w:w="0"/>
@@ -370,65 +416,89 @@
         <w:p>
           <w:pPr>
             <w:spacing w:after="0" w:before="0"/>
-          </w:pPr>
-          <w:r>
-            <w:rPr>
-              <w:rFonts w:ascii="Calibri" w:cs="Calibri" w:eastAsia="Calibri" w:hAnsi="Calibri"/>
-              <w:b/>
-              <w:bCs/>
-              <w:color w:val="14120F"/>
-              <w:sz w:val="50"/>
-              <w:szCs w:val="50"/>
-            </w:rPr>
-            <w:t xml:space="preserve">Para</w:t>
-          </w:r>
-          <w:r>
-            <w:rPr>
-              <w:rFonts w:ascii="Calibri" w:cs="Calibri" w:eastAsia="Calibri" w:hAnsi="Calibri"/>
-              <w:b/>
-              <w:bCs/>
-              <w:color w:val="8A5024"/>
-              <w:sz w:val="50"/>
-              <w:szCs w:val="50"/>
-            </w:rPr>
-            <w:t xml:space="preserve">Tech</w:t>
-          </w:r>
-          <w:r>
-            <w:rPr>
-              <w:rFonts w:ascii="Calibri" w:cs="Calibri" w:eastAsia="Calibri" w:hAnsi="Calibri"/>
-              <w:b/>
-              <w:bCs/>
-              <w:color w:val="14120F"/>
-              <w:sz w:val="50"/>
-              <w:szCs w:val="50"/>
-            </w:rPr>
-            <w:t xml:space="preserve"> Solutions</w:t>
-          </w:r>
-        </w:p>
-        <w:p>
-          <w:pPr>
-            <w:spacing w:after="0" w:before="70"/>
-          </w:pPr>
-          <w:r>
-            <w:rPr>
-              <w:rFonts w:ascii="Calibri" w:cs="Calibri" w:eastAsia="Calibri" w:hAnsi="Calibri"/>
-              <w:color w:val="6B655E"/>
-              <w:sz w:val="15"/>
-              <w:szCs w:val="15"/>
-            </w:rPr>
-            <w:t xml:space="preserve">A I  &amp;  D I G I T A L  S O L U T I O N S</w:t>
+            <w:jc w:val="center"/>
+          </w:pPr>
+          <w:r>
+            <w:rPr>
+              <w:rFonts w:ascii="Calibri" w:cs="Calibri" w:eastAsia="Calibri" w:hAnsi="Calibri"/>
+              <w:color w:val="C08040"/>
+              <w:sz w:val="56"/>
+              <w:szCs w:val="56"/>
+            </w:rPr>
+            <w:t xml:space="preserve">|</w:t>
           </w:r>
         </w:p>
       </w:tc>
       <w:tc>
         <w:tcPr>
-          <w:tcW w:type="dxa" w:w="5022"/>
+          <w:tcW w:type="dxa" w:w="4700"/>
           <w:tcBorders>
             <w:top w:val="none" w:color="auto" w:sz="0"/>
             <w:left w:val="none" w:color="auto" w:sz="0"/>
             <w:bottom w:val="none" w:color="auto" w:sz="0"/>
             <w:right w:val="none" w:color="auto" w:sz="0"/>
           </w:tcBorders>
+          <w:shd w:fill="0B0A09" w:color="auto" w:val="clear"/>
+          <w:tcMar>
+            <w:top w:type="dxa" w:w="0"/>
+            <w:left w:type="dxa" w:w="0"/>
+            <w:bottom w:type="dxa" w:w="0"/>
+            <w:right w:type="dxa" w:w="0"/>
+          </w:tcMar>
+          <w:vAlign w:val="center"/>
+        </w:tcPr>
+        <w:p>
+          <w:pPr>
+            <w:spacing w:after="0" w:before="0"/>
+          </w:pPr>
+          <w:r>
+            <w:rPr>
+              <w:rFonts w:ascii="Calibri" w:cs="Calibri" w:eastAsia="Calibri" w:hAnsi="Calibri"/>
+              <w:b/>
+              <w:bCs/>
+              <w:color w:val="FFFFFF"/>
+              <w:sz w:val="56"/>
+              <w:szCs w:val="56"/>
+            </w:rPr>
+            <w:t xml:space="preserve">Para</w:t>
+          </w:r>
+          <w:r>
+            <w:rPr>
+              <w:rFonts w:ascii="Calibri" w:cs="Calibri" w:eastAsia="Calibri" w:hAnsi="Calibri"/>
+              <w:b/>
+              <w:bCs/>
+              <w:color w:val="C08040"/>
+              <w:sz w:val="56"/>
+              <w:szCs w:val="56"/>
+            </w:rPr>
+            <w:t xml:space="preserve">Tech</w:t>
+          </w:r>
+        </w:p>
+        <w:p>
+          <w:pPr>
+            <w:spacing w:after="0" w:before="80"/>
+          </w:pPr>
+          <w:r>
+            <w:rPr>
+              <w:rFonts w:ascii="Calibri" w:cs="Calibri" w:eastAsia="Calibri" w:hAnsi="Calibri"/>
+              <w:color w:val="B5AFA6"/>
+              <w:sz w:val="15"/>
+              <w:szCs w:val="15"/>
+            </w:rPr>
+            <w:t xml:space="preserve">S O L U T I O N S</w:t>
+          </w:r>
+        </w:p>
+      </w:tc>
+      <w:tc>
+        <w:tcPr>
+          <w:tcW w:type="dxa" w:w="4522"/>
+          <w:tcBorders>
+            <w:top w:val="none" w:color="auto" w:sz="0"/>
+            <w:left w:val="none" w:color="auto" w:sz="0"/>
+            <w:bottom w:val="none" w:color="auto" w:sz="0"/>
+            <w:right w:val="none" w:color="auto" w:sz="0"/>
+          </w:tcBorders>
+          <w:shd w:fill="0B0A09" w:color="auto" w:val="clear"/>
           <w:tcMar>
             <w:top w:type="dxa" w:w="0"/>
             <w:left w:type="dxa" w:w="0"/>
@@ -439,70 +509,32 @@
         </w:tcPr>
         <w:p>
           <w:pPr>
-            <w:spacing w:after="20" w:before="0"/>
+            <w:spacing w:after="0" w:before="0"/>
             <w:jc w:val="right"/>
           </w:pPr>
           <w:r>
             <w:rPr>
               <w:rFonts w:ascii="Calibri" w:cs="Calibri" w:eastAsia="Calibri" w:hAnsi="Calibri"/>
-              <w:b/>
-              <w:bCs/>
-              <w:color w:val="14120F"/>
-              <w:sz w:val="17"/>
-              <w:szCs w:val="17"/>
-            </w:rPr>
-            <w:t xml:space="preserve">Lahore, Pakistan</w:t>
-          </w:r>
-        </w:p>
-        <w:p>
-          <w:pPr>
-            <w:spacing w:after="20" w:before="0"/>
+              <w:color w:val="D19A5F"/>
+              <w:sz w:val="15"/>
+              <w:szCs w:val="15"/>
+            </w:rPr>
+            <w:t xml:space="preserve">A I  &amp;  D I G I T A L</w:t>
+          </w:r>
+        </w:p>
+        <w:p>
+          <w:pPr>
+            <w:spacing w:after="0" w:before="40"/>
             <w:jc w:val="right"/>
           </w:pPr>
           <w:r>
             <w:rPr>
               <w:rFonts w:ascii="Calibri" w:cs="Calibri" w:eastAsia="Calibri" w:hAnsi="Calibri"/>
-              <w:b w:val="false"/>
-              <w:bCs w:val="false"/>
-              <w:color w:val="4A4540"/>
-              <w:sz w:val="17"/>
-              <w:szCs w:val="17"/>
-            </w:rPr>
-            <w:t xml:space="preserve">+92 331 3313567</w:t>
-          </w:r>
-        </w:p>
-        <w:p>
-          <w:pPr>
-            <w:spacing w:after="20" w:before="0"/>
-            <w:jc w:val="right"/>
-          </w:pPr>
-          <w:r>
-            <w:rPr>
-              <w:rFonts w:ascii="Calibri" w:cs="Calibri" w:eastAsia="Calibri" w:hAnsi="Calibri"/>
-              <w:b w:val="false"/>
-              <w:bCs w:val="false"/>
-              <w:color w:val="4A4540"/>
-              <w:sz w:val="17"/>
-              <w:szCs w:val="17"/>
-            </w:rPr>
-            <w:t xml:space="preserve">contact@paratechsolutions.com</w:t>
-          </w:r>
-        </w:p>
-        <w:p>
-          <w:pPr>
-            <w:spacing w:after="20" w:before="0"/>
-            <w:jc w:val="right"/>
-          </w:pPr>
-          <w:r>
-            <w:rPr>
-              <w:rFonts w:ascii="Calibri" w:cs="Calibri" w:eastAsia="Calibri" w:hAnsi="Calibri"/>
-              <w:b w:val="false"/>
-              <w:bCs w:val="false"/>
-              <w:color w:val="4A4540"/>
-              <w:sz w:val="17"/>
-              <w:szCs w:val="17"/>
-            </w:rPr>
-            <w:t xml:space="preserve">www.paratechsolutions.com</w:t>
+              <w:color w:val="D19A5F"/>
+              <w:sz w:val="15"/>
+              <w:szCs w:val="15"/>
+            </w:rPr>
+            <w:t xml:space="preserve">S O L U T I O N S</w:t>
           </w:r>
         </w:p>
       </w:tc>
@@ -510,16 +542,9 @@
   </w:tbl>
   <w:p>
     <w:pPr>
-      <w:spacing w:after="0" w:before="0" w:line="60" w:lineRule="exact"/>
-    </w:pPr>
-  </w:p>
-  <w:p>
-    <w:pPr>
-      <w:pBdr>
-        <w:bottom w:val="single" w:color="C08040" w:sz="8" w:space="1"/>
-      </w:pBdr>
-      <w:spacing w:after="0" w:before="0"/>
-      <w:ind w:left="0" w:right="0"/>
+      <w:shd w:fill="C08040" w:color="auto" w:val="clear"/>
+      <w:spacing w:after="0" w:before="0" w:line="40" w:lineRule="exact"/>
+      <w:ind w:left="-1134" w:right="-1134"/>
     </w:pPr>
   </w:p>
 </w:hdr>

</xml_diff>

<commit_message>
Put 'Solutions' right after 'ParaTech' in letterhead wordmark
Co-Authored-By: Claude Sonnet 5.5 <noreply@anthropic.com>
Claude-Session: https://claude.ai/code/session_01DFo29tTCUxjQWejnLXZyRx
</commit_message>
<xml_diff>
--- a/letterhead/ParaTech-Letterhead.docx
+++ b/letterhead/ParaTech-Letterhead.docx
@@ -324,8 +324,7 @@
     <w:tblGrid>
       <w:gridCol w:w="2384"/>
       <w:gridCol w:w="300"/>
-      <w:gridCol w:w="4700"/>
-      <w:gridCol w:w="4522"/>
+      <w:gridCol w:w="9222"/>
     </w:tblGrid>
     <w:tr>
       <w:trPr>
@@ -431,7 +430,7 @@
       </w:tc>
       <w:tc>
         <w:tcPr>
-          <w:tcW w:type="dxa" w:w="4700"/>
+          <w:tcW w:type="dxa" w:w="9222"/>
           <w:tcBorders>
             <w:top w:val="none" w:color="auto" w:sz="0"/>
             <w:left w:val="none" w:color="auto" w:sz="0"/>
@@ -473,44 +472,21 @@
             </w:rPr>
             <w:t xml:space="preserve">Tech</w:t>
           </w:r>
+          <w:r>
+            <w:rPr>
+              <w:rFonts w:ascii="Calibri" w:cs="Calibri" w:eastAsia="Calibri" w:hAnsi="Calibri"/>
+              <w:b/>
+              <w:bCs/>
+              <w:color w:val="FFFFFF"/>
+              <w:sz w:val="56"/>
+              <w:szCs w:val="56"/>
+            </w:rPr>
+            <w:t xml:space="preserve"> Solutions</w:t>
+          </w:r>
         </w:p>
         <w:p>
           <w:pPr>
             <w:spacing w:after="0" w:before="80"/>
-          </w:pPr>
-          <w:r>
-            <w:rPr>
-              <w:rFonts w:ascii="Calibri" w:cs="Calibri" w:eastAsia="Calibri" w:hAnsi="Calibri"/>
-              <w:color w:val="B5AFA6"/>
-              <w:sz w:val="15"/>
-              <w:szCs w:val="15"/>
-            </w:rPr>
-            <w:t xml:space="preserve">S O L U T I O N S</w:t>
-          </w:r>
-        </w:p>
-      </w:tc>
-      <w:tc>
-        <w:tcPr>
-          <w:tcW w:type="dxa" w:w="4522"/>
-          <w:tcBorders>
-            <w:top w:val="none" w:color="auto" w:sz="0"/>
-            <w:left w:val="none" w:color="auto" w:sz="0"/>
-            <w:bottom w:val="none" w:color="auto" w:sz="0"/>
-            <w:right w:val="none" w:color="auto" w:sz="0"/>
-          </w:tcBorders>
-          <w:shd w:fill="0B0A09" w:color="auto" w:val="clear"/>
-          <w:tcMar>
-            <w:top w:type="dxa" w:w="0"/>
-            <w:left w:type="dxa" w:w="0"/>
-            <w:bottom w:type="dxa" w:w="0"/>
-            <w:right w:type="dxa" w:w="1134"/>
-          </w:tcMar>
-          <w:vAlign w:val="center"/>
-        </w:tcPr>
-        <w:p>
-          <w:pPr>
-            <w:spacing w:after="0" w:before="0"/>
-            <w:jc w:val="right"/>
           </w:pPr>
           <w:r>
             <w:rPr>
@@ -519,22 +495,7 @@
               <w:sz w:val="15"/>
               <w:szCs w:val="15"/>
             </w:rPr>
-            <w:t xml:space="preserve">A I  &amp;  D I G I T A L</w:t>
-          </w:r>
-        </w:p>
-        <w:p>
-          <w:pPr>
-            <w:spacing w:after="0" w:before="40"/>
-            <w:jc w:val="right"/>
-          </w:pPr>
-          <w:r>
-            <w:rPr>
-              <w:rFonts w:ascii="Calibri" w:cs="Calibri" w:eastAsia="Calibri" w:hAnsi="Calibri"/>
-              <w:color w:val="D19A5F"/>
-              <w:sz w:val="15"/>
-              <w:szCs w:val="15"/>
-            </w:rPr>
-            <w:t xml:space="preserve">S O L U T I O N S</w:t>
+            <w:t xml:space="preserve">A I  &amp;  D I G I T A L  S O L U T I O N S</w:t>
           </w:r>
         </w:p>
       </w:tc>

</xml_diff>